<commit_message>
Add reference ordering final step
</commit_message>
<xml_diff>
--- a/examples/nhanes-undiagnosed-diabetes/submission_package/manuscript_final_with_tables_figures.docx
+++ b/examples/nhanes-undiagnosed-diabetes/submission_package/manuscript_final_with_tables_figures.docx
@@ -239,7 +239,7 @@
           <w:b w:val="0"/>
           <w:sz w:val="20"/>
         </w:rPr>
-        <w:t>Diabetes remains a major chronic disease burden in the United States, but diagnosed disease represents only part of the glycemic risk landscape. National surveillance reports continue to distinguish total diabetes, diagnosed diabetes, and undiagnosed diabetes because a meaningful portion of adults have laboratory evidence of diabetes without a corresponding self-reported diagnosis. The National Center for Health Statistics reported that during August 2021-August 2023, the prevalence of total, diagnosed, and undiagnosed diabetes among U.S. adults was 15.8%, 11.3%, and 4.5%, respectively, with prevalence increasing by age and weight status [7]. This surveillance framing is important because diabetes detection is not only a matter of biology; it also depends on access to screening, health care contact, clinical follow-up, patient awareness, and the tests used to define disease.</w:t>
+        <w:t>Diabetes remains a major chronic disease burden in the United States, but diagnosed disease represents only part of the glycemic risk landscape. National surveillance reports continue to distinguish total diabetes, diagnosed diabetes, and undiagnosed diabetes because a meaningful portion of adults have laboratory evidence of diabetes without a corresponding self-reported diagnosis. The National Center for Health Statistics reported that during August 2021-August 2023, the prevalence of total, diagnosed, and undiagnosed diabetes among U.S. adults was 15.8%, 11.3%, and 4.5%, respectively, with prevalence increasing by age and weight status [1]. This surveillance framing is important because diabetes detection is not only a matter of biology; it also depends on access to screening, health care contact, clinical follow-up, patient awareness, and the tests used to define disease.</w:t>
       </w:r>
     </w:p>
     <w:p>
@@ -249,7 +249,7 @@
           <w:b w:val="0"/>
           <w:sz w:val="20"/>
         </w:rPr>
-        <w:t>Self-reported diabetes status is useful in population surveys, but it cannot fully capture glycemic abnormalities in people who have not been tested, have not received results, or do not recall a prior diagnosis. Laboratory-defined undiagnosed diabetes therefore has two linked meanings. Epidemiologically, it identifies a subgroup in which measured glycemia falls within the diabetes range. Clinically, it flags a screening gap rather than a definitive diagnosis, because diagnostic standards generally require confirmatory testing unless symptoms are present. The American Diabetes Association lists HbA1c &gt;=6.5% as a diabetes-range threshold and HbA1c 5.7%-6.4% as a prediabetes range; fasting plasma glucose &gt;=126 mg/dL is another diabetes-range criterion [5]. The National Institute of Diabetes and Digestive and Kidney Diseases similarly emphasizes that abnormal A1C results used for diagnosis usually require confirmation with a second measurement [6]. In population research, this distinction is essential: a single HbA1c value can define an epidemiologic category, but it should not be described as a clinical diagnosis.</w:t>
+        <w:t>Self-reported diabetes status is useful in population surveys, but it cannot fully capture glycemic abnormalities in people who have not been tested, have not received results, or do not recall a prior diagnosis. Laboratory-defined undiagnosed diabetes therefore has two linked meanings. Epidemiologically, it identifies a subgroup in which measured glycemia falls within the diabetes range. Clinically, it flags a screening gap rather than a definitive diagnosis, because diagnostic standards generally require confirmatory testing unless symptoms are present. The American Diabetes Association lists HbA1c &gt;=6.5% as a diabetes-range threshold and HbA1c 5.7%-6.4% as a prediabetes range; fasting plasma glucose &gt;=126 mg/dL is another diabetes-range criterion [2]. The National Institute of Diabetes and Digestive and Kidney Diseases similarly emphasizes that abnormal A1C results used for diagnosis usually require confirmation with a second measurement [3]. In population research, this distinction is essential: a single HbA1c value can define an epidemiologic category, but it should not be described as a clinical diagnosis.</w:t>
       </w:r>
     </w:p>
     <w:p>
@@ -259,7 +259,7 @@
           <w:b w:val="0"/>
           <w:sz w:val="20"/>
         </w:rPr>
-        <w:t>The National Health and Nutrition Examination Survey (NHANES) is well suited to examine undiagnosed diabetes because it combines interviews, standardized physical examination, and laboratory measurements in a probability sample of the U.S. civilian noninstitutionalized population. NHANES provides demographic data, anthropometry, blood pressure, health questionnaires, and laboratory measures, including glycohemoglobin and fasting glucose in the 2017-2018 cycle. Its complex sampling design requires analytic weights, strata, and primary sampling units to produce representative estimates and valid variance estimates. NHANES analytic guidelines and weighting tutorials emphasize that weights account for unequal selection probabilities, oversampling, non-response, and post-stratification adjustment [1,2]. For studies of glycemic status in the general adult population, these design features allow researchers to move beyond convenience samples and estimate population-level patterns.</w:t>
+        <w:t>The National Health and Nutrition Examination Survey (NHANES) is well suited to examine undiagnosed diabetes because it combines interviews, standardized physical examination, and laboratory measurements in a probability sample of the U.S. civilian noninstitutionalized population. NHANES provides demographic data, anthropometry, blood pressure, health questionnaires, and laboratory measures, including glycohemoglobin and fasting glucose in the 2017-2018 cycle. Its complex sampling design requires analytic weights, strata, and primary sampling units to produce representative estimates and valid variance estimates. NHANES analytic guidelines and weighting tutorials emphasize that weights account for unequal selection probabilities, oversampling, non-response, and post-stratification adjustment [4-5]. For studies of glycemic status in the general adult population, these design features allow researchers to move beyond convenience samples and estimate population-level patterns.</w:t>
       </w:r>
     </w:p>
     <w:p>
@@ -269,7 +269,7 @@
           <w:b w:val="0"/>
           <w:sz w:val="20"/>
         </w:rPr>
-        <w:t>Prior NHANES-based studies have examined diabetes prevalence trends, undiagnosed diabetes definitions, population screening patterns, and discrepancies between HbA1c-based and glucose-based glycemic classification [9-13]. These studies provide important background but leave room for narrower analyses focused on the profile of people who self-report no diabetes diagnosis while meeting laboratory criteria for diabetes-range HbA1c. The research gap is not that undiagnosed diabetes has never been studied; rather, it is that screening-relevant cardiometabolic and lifestyle correlates can be described in a way that links routine measurements to the subgroup most likely to be missed by self-report alone. This framing is especially relevant for public health and primary care because variables such as waist circumference, blood pressure, and lipid measures are widely available or relatively inexpensive compared with advanced metabolic testing.</w:t>
+        <w:t>Prior NHANES-based studies have examined diabetes prevalence trends, undiagnosed diabetes definitions, population screening patterns, and discrepancies between HbA1c-based and glucose-based glycemic classification [6-10]. These studies provide important background but leave room for narrower analyses focused on the profile of people who self-report no diabetes diagnosis while meeting laboratory criteria for diabetes-range HbA1c. The research gap is not that undiagnosed diabetes has never been studied; rather, it is that screening-relevant cardiometabolic and lifestyle correlates can be described in a way that links routine measurements to the subgroup most likely to be missed by self-report alone. This framing is especially relevant for public health and primary care because variables such as waist circumference, blood pressure, and lipid measures are widely available or relatively inexpensive compared with advanced metabolic testing.</w:t>
       </w:r>
     </w:p>
     <w:p>
@@ -279,7 +279,7 @@
           <w:b w:val="0"/>
           <w:sz w:val="20"/>
         </w:rPr>
-        <w:t>Anthropometric measures are central to this question. Body mass index is commonly used to categorize weight status, but waist circumference may capture central adiposity more directly. Central adiposity is closely related to insulin resistance and adverse cardiometabolic risk profiles, and NHANES-based studies have examined waist circumference and other body shape indices in relation to glycemic outcomes [14]. In the present analysis, waist circumference was selected for the primary parsimonious model because it was directly measured in NHANES, is interpretable in clinical and public health settings, and avoids overloading a single-cycle model with multiple correlated adiposity variables. BMI and categorical obesity were retained for descriptive and sensitivity analyses.</w:t>
+        <w:t>Anthropometric measures are central to this question. Body mass index is commonly used to categorize weight status, but waist circumference may capture central adiposity more directly. Central adiposity is closely related to insulin resistance and adverse cardiometabolic risk profiles, and NHANES-based studies have examined waist circumference and other body shape indices in relation to glycemic outcomes [11]. In the present analysis, waist circumference was selected for the primary parsimonious model because it was directly measured in NHANES, is interpretable in clinical and public health settings, and avoids overloading a single-cycle model with multiple correlated adiposity variables. BMI and categorical obesity were retained for descriptive and sensitivity analyses.</w:t>
       </w:r>
     </w:p>
     <w:p>
@@ -289,7 +289,7 @@
           <w:b w:val="0"/>
           <w:sz w:val="20"/>
         </w:rPr>
-        <w:t>Lipid measures may also help characterize undiagnosed glycemic abnormalities. Non-HDL cholesterol, calculated as total cholesterol minus HDL cholesterol, captures cholesterol carried by atherogenic lipoproteins and is often easier to derive than more specialized lipid measures. Recent NHANES and cohort studies have reported associations between non-HDL cholesterol, non-HDL-to-HDL cholesterol ratio, and diabetes or incident diabetes risk [15-17]. The current study used non-HDL cholesterol rather than a more novel lipid ratio as a conservative and clinically interpretable marker. This choice supports the study's screening-oriented objective while avoiding overemphasis on a single derived index.</w:t>
+        <w:t>Lipid measures may also help characterize undiagnosed glycemic abnormalities. Non-HDL cholesterol, calculated as total cholesterol minus HDL cholesterol, captures cholesterol carried by atherogenic lipoproteins and is often easier to derive than more specialized lipid measures. Recent NHANES and cohort studies have reported associations between non-HDL cholesterol, non-HDL-to-HDL cholesterol ratio, and diabetes or incident diabetes risk [12-14]. The current study used non-HDL cholesterol rather than a more novel lipid ratio as a conservative and clinically interpretable marker. This choice supports the study's screening-oriented objective while avoiding overemphasis on a single derived index.</w:t>
       </w:r>
     </w:p>
     <w:p>
@@ -371,7 +371,7 @@
           <w:b w:val="0"/>
           <w:sz w:val="20"/>
         </w:rPr>
-        <w:t>The present analysis used 12 NHANES files: demographic data (DEMO_J), body measures (BMX_J), blood pressure examination data (BPX_J), diabetes questionnaire data (DIQ_J), glycohemoglobin (GHB_J), fasting plasma glucose (GLU_J), blood pressure and cholesterol questionnaire data (BPQ_J), total cholesterol (TCHOL_J), HDL cholesterol (HDL_J), physical activity questionnaire data (PAQ_J), smoking questionnaire data (SMQ_J), and sleep questionnaire data (SLQ_J). Files were linked using the respondent sequence number (SEQN). Glycohemoglobin was identified using the NHANES variable LBXGH, documented as glycohemoglobin (%) in the 2017-2018 laboratory documentation [3,4].</w:t>
+        <w:t>The present analysis used 12 NHANES files: demographic data (DEMO_J), body measures (BMX_J), blood pressure examination data (BPX_J), diabetes questionnaire data (DIQ_J), glycohemoglobin (GHB_J), fasting plasma glucose (GLU_J), blood pressure and cholesterol questionnaire data (BPQ_J), total cholesterol (TCHOL_J), HDL cholesterol (HDL_J), physical activity questionnaire data (PAQ_J), smoking questionnaire data (SMQ_J), and sleep questionnaire data (SLQ_J). Files were linked using the respondent sequence number (SEQN). Glycohemoglobin was identified using the NHANES variable LBXGH, documented as glycohemoglobin (%) in the 2017-2018 laboratory documentation [15-16].</w:t>
       </w:r>
     </w:p>
     <w:p>
@@ -427,7 +427,7 @@
           <w:b w:val="0"/>
           <w:sz w:val="20"/>
         </w:rPr>
-        <w:t>A sensitivity definition of undiagnosed diabetes incorporated fasting plasma glucose. Participants were classified as having HbA1c- or fasting-glucose-defined undiagnosed diabetes if HbA1c was &gt;=6.5% or fasting plasma glucose was &gt;=126 mg/dL. Because fasting glucose data were available only for the fasting subsample, this definition was treated as a sensitivity analysis using fasting subsample weights (WTSAF2YR) rather than the primary outcome. The diagnostic thresholds were based on ADA and NIDDK criteria [5,6], but the study language treats these measures as epidemiologic definitions rather than clinical diagnoses because confirmatory testing was not available.</w:t>
+        <w:t>A sensitivity definition of undiagnosed diabetes incorporated fasting plasma glucose. Participants were classified as having HbA1c- or fasting-glucose-defined undiagnosed diabetes if HbA1c was &gt;=6.5% or fasting plasma glucose was &gt;=126 mg/dL. Because fasting glucose data were available only for the fasting subsample, this definition was treated as a sensitivity analysis using fasting subsample weights (WTSAF2YR) rather than the primary outcome. The diagnostic thresholds were based on ADA and NIDDK criteria [2-3], but the study language treats these measures as epidemiologic definitions rather than clinical diagnoses because confirmatory testing was not available.</w:t>
       </w:r>
     </w:p>
     <w:p>
@@ -827,7 +827,7 @@
           <w:b w:val="0"/>
           <w:sz w:val="20"/>
         </w:rPr>
-        <w:t>The lower primary prevalence estimate in this study should not be interpreted as evidence that undiagnosed diabetes is unimportant. A weighted prevalence near 2% among self-reported non-diabetic adults still represents a meaningful public health signal, especially because the same analytic population had a much larger burden of HbA1c-defined prediabetes. The prediabetes estimate is relevant because people in this range may not have symptoms and may not be aware of their glycemic status. Public health objectives such as Healthy People 2030 explicitly track undiagnosed prediabetes awareness [8], reflecting the view that earlier identification is part of chronic disease prevention. The current findings therefore fit within a broader prevention continuum rather than a narrow disease-detection frame.</w:t>
+        <w:t>The lower primary prevalence estimate in this study should not be interpreted as evidence that undiagnosed diabetes is unimportant. A weighted prevalence near 2% among self-reported non-diabetic adults still represents a meaningful public health signal, especially because the same analytic population had a much larger burden of HbA1c-defined prediabetes. The prediabetes estimate is relevant because people in this range may not have symptoms and may not be aware of their glycemic status. Public health objectives such as Healthy People 2030 explicitly track undiagnosed prediabetes awareness [17], reflecting the view that earlier identification is part of chronic disease prevention. The current findings therefore fit within a broader prevention continuum rather than a narrow disease-detection frame.</w:t>
       </w:r>
     </w:p>
     <w:p>
@@ -951,7 +951,7 @@
           <w:b w:val="0"/>
           <w:sz w:val="20"/>
         </w:rPr>
-        <w:t>The finding among non-Hispanic Asian participants is particularly important because prior NHANES analyses have reported a relatively high proportion of undiagnosed diabetes among Asian American adults [9,10]. However, this study did not test ethnicity-specific BMI or waist thresholds, nor did it disaggregate Asian subgroups. The broad non-Hispanic Asian category may mask substantial heterogeneity. Similarly, the higher odds among non-Hispanic Black participants may reflect a combination of cardiometabolic risk, access to care, structural inequities, and diagnostic opportunities. Prior studies have reported racial and ethnic differences in cardiometabolic risk among adults with undiagnosed diabetes and gaps between guideline-based screening eligibility and actual screening behavior [18,19]. Future studies with larger samples and more detailed social and health care access measures are needed to clarify these patterns.</w:t>
+        <w:t>The finding among non-Hispanic Asian participants is particularly important because prior NHANES analyses have reported a relatively high proportion of undiagnosed diabetes among Asian American adults [6-7]. However, this study did not test ethnicity-specific BMI or waist thresholds, nor did it disaggregate Asian subgroups. The broad non-Hispanic Asian category may mask substantial heterogeneity. Similarly, the higher odds among non-Hispanic Black participants may reflect a combination of cardiometabolic risk, access to care, structural inequities, and diagnostic opportunities. Prior studies have reported racial and ethnic differences in cardiometabolic risk among adults with undiagnosed diabetes and gaps between guideline-based screening eligibility and actual screening behavior [18-19]. Future studies with larger samples and more detailed social and health care access measures are needed to clarify these patterns.</w:t>
       </w:r>
     </w:p>
     <w:p>
@@ -9046,7 +9046,7 @@
           <w:b w:val="0"/>
           <w:sz w:val="20"/>
         </w:rPr>
-        <w:t>1. Centers for Disease Control and Prevention, National Center for Health Statistics. NHANES Survey Methods and Analytic Guidelines. Accessed June 10, 2026. https://wwwn.cdc.gov/nchs/nhanes/analyticguidelines.aspx</w:t>
+        <w:t>1. Centers for Disease Control and Prevention, National Center for Health Statistics. Prevalence of Total, Diagnosed, and Undiagnosed Diabetes in Adults: United States, August 2021-August 2023. NCHS Data Brief No. 516. Accessed June 10, 2026. https://www.cdc.gov/nchs/products/databriefs/db516.htm</w:t>
       </w:r>
     </w:p>
     <w:p>
@@ -9056,7 +9056,7 @@
           <w:b w:val="0"/>
           <w:sz w:val="20"/>
         </w:rPr>
-        <w:t>2. Centers for Disease Control and Prevention, National Center for Health Statistics. NHANES Weighting Module. Accessed June 10, 2026. https://wwwn.cdc.gov/nchs/nhanes/tutorials/weighting.aspx</w:t>
+        <w:t>2. American Diabetes Association. Diabetes Diagnosis. Accessed June 10, 2026. https://diabetes.org/about-diabetes/diagnosis</w:t>
       </w:r>
     </w:p>
     <w:p>
@@ -9066,7 +9066,7 @@
           <w:b w:val="0"/>
           <w:sz w:val="20"/>
         </w:rPr>
-        <w:t>3. Centers for Disease Control and Prevention, National Center for Health Statistics. Glycohemoglobin, GHB_J, NHANES 2017-2018 Data Documentation, Codebook, and Frequencies. Accessed June 10, 2026. https://wwwn.cdc.gov/Nchs/Data/Nhanes/Public/2017/DataFiles/GHB_J.htm</w:t>
+        <w:t>3. National Institute of Diabetes and Digestive and Kidney Diseases. The A1C Test &amp; Diabetes. Accessed June 10, 2026. https://www.niddk.nih.gov/health-information/diagnostic-tests/a1c-test</w:t>
       </w:r>
     </w:p>
     <w:p>
@@ -9076,7 +9076,7 @@
           <w:b w:val="0"/>
           <w:sz w:val="20"/>
         </w:rPr>
-        <w:t>4. Centers for Disease Control and Prevention, National Center for Health Statistics. NHANES 2017-2018 Laboratory Data. Accessed June 10, 2026. https://wwwn.cdc.gov/nchs/nhanes/search/datapage.aspx?Component=Laboratory&amp;Cycle=2017-2018</w:t>
+        <w:t>4. Centers for Disease Control and Prevention, National Center for Health Statistics. NHANES Survey Methods and Analytic Guidelines. Accessed June 10, 2026. https://wwwn.cdc.gov/nchs/nhanes/analyticguidelines.aspx</w:t>
       </w:r>
     </w:p>
     <w:p>
@@ -9086,7 +9086,7 @@
           <w:b w:val="0"/>
           <w:sz w:val="20"/>
         </w:rPr>
-        <w:t>5. American Diabetes Association. Diabetes Diagnosis. Accessed June 10, 2026. https://diabetes.org/about-diabetes/diagnosis</w:t>
+        <w:t>5. Centers for Disease Control and Prevention, National Center for Health Statistics. NHANES Weighting Module. Accessed June 10, 2026. https://wwwn.cdc.gov/nchs/nhanes/tutorials/weighting.aspx</w:t>
       </w:r>
     </w:p>
     <w:p>
@@ -9096,7 +9096,7 @@
           <w:b w:val="0"/>
           <w:sz w:val="20"/>
         </w:rPr>
-        <w:t>6. National Institute of Diabetes and Digestive and Kidney Diseases. The A1C Test &amp; Diabetes. Accessed June 10, 2026. https://www.niddk.nih.gov/health-information/diagnostic-tests/a1c-test</w:t>
+        <w:t>6. Menke A, Casagrande S, Geiss L, Cowie CC. Prevalence of and trends in diabetes among adults in the United States, 1988-2012. JAMA. 2015;314(10):1021-1029. doi:10.1001/jama.2015.10029</w:t>
       </w:r>
     </w:p>
     <w:p>
@@ -9106,7 +9106,7 @@
           <w:b w:val="0"/>
           <w:sz w:val="20"/>
         </w:rPr>
-        <w:t>7. Centers for Disease Control and Prevention, National Center for Health Statistics. Prevalence of Total, Diagnosed, and Undiagnosed Diabetes in Adults: United States, August 2021-August 2023. NCHS Data Brief No. 516. Accessed June 10, 2026. https://www.cdc.gov/nchs/products/databriefs/db516.htm</w:t>
+        <w:t>7. Fang M, Wang D, Coresh J, Selvin E. Undiagnosed diabetes in U.S. adults: prevalence and trends. Diabetes Care. 2022;45(9):1994-2002. doi:10.2337/dc22-0242</w:t>
       </w:r>
     </w:p>
     <w:p>
@@ -9116,7 +9116,7 @@
           <w:b w:val="0"/>
           <w:sz w:val="20"/>
         </w:rPr>
-        <w:t>8. Healthy People 2030. Reduce the proportion of adults who do not know they have prediabetes: D-02. Accessed June 10, 2026. https://odphp.health.gov/healthypeople/objectives-and-data/browse-objectives/diabetes/reduce-proportion-adults-who-dont-know-they-have-prediabetes-d-02/data-methodology</w:t>
+        <w:t>8. Gupta K, Obeidat L, Kakar TS, Fadel RA, Al Rifai M, Abushamat LA, Virani SS. Trends in undiagnosed diabetes mellitus among United States adults: cross-sectional analyses from NHANES 2011-2020. Am J Cardiol. 2022;175:184-185. doi:10.1016/j.amjcard.2022.04.032</w:t>
       </w:r>
     </w:p>
     <w:p>
@@ -9126,7 +9126,7 @@
           <w:b w:val="0"/>
           <w:sz w:val="20"/>
         </w:rPr>
-        <w:t>9. Menke A, Casagrande S, Geiss L, Cowie CC. Prevalence of and trends in diabetes among adults in the United States, 1988-2012. JAMA. 2015;314(10):1021-1029. doi:10.1001/jama.2015.10029</w:t>
+        <w:t>9. Kiefer MM, Silverman JB, Young BA, Nelson KM. National patterns in diabetes screening: data from the National Health and Nutrition Examination Survey (NHANES) 2005-2012. J Gen Intern Med. 2015;30(5):612-618. doi:10.1007/s11606-014-3147-8</w:t>
       </w:r>
     </w:p>
     <w:p>
@@ -9136,7 +9136,7 @@
           <w:b w:val="0"/>
           <w:sz w:val="20"/>
         </w:rPr>
-        <w:t>10. Fang M, Wang D, Coresh J, Selvin E. Undiagnosed diabetes in U.S. adults: prevalence and trends. Diabetes Care. 2022;45(9):1994-2002. doi:10.2337/dc22-0242</w:t>
+        <w:t>10. Staimez LR, Kipling LM, Nina Ham J, Legvold BT, Jackson SL, Wilson PWF, Rhee MK, Phillips LS. Potential misclassification of diabetes and prediabetes in the U.S.: mismatched HbA1c and glucose in NHANES 2005-2016. Diabetes Res Clin Pract. 2022;189:109935. doi:10.1016/j.diabres.2022.109935</w:t>
       </w:r>
     </w:p>
     <w:p>
@@ -9146,7 +9146,7 @@
           <w:b w:val="0"/>
           <w:sz w:val="20"/>
         </w:rPr>
-        <w:t>11. Gupta K, Obeidat L, Kakar TS, Fadel RA, Al Rifai M, Abushamat LA, Virani SS. Trends in undiagnosed diabetes mellitus among United States adults: cross-sectional analyses from NHANES 2011-2020. Am J Cardiol. 2022;175:184-185. doi:10.1016/j.amjcard.2022.04.032</w:t>
+        <w:t>11. Firouzi SA, Tucker LA, LeCheminant JD, Bailey BW. Sagittal abdominal diameter, waist circumference, and BMI as predictors of multiple measures of glucose metabolism: an NHANES investigation of US adults. J Diabetes Res. 2018;2018:3604108. doi:10.1155/2018/3604108</w:t>
       </w:r>
     </w:p>
     <w:p>
@@ -9156,7 +9156,7 @@
           <w:b w:val="0"/>
           <w:sz w:val="20"/>
         </w:rPr>
-        <w:t>12. Kiefer MM, Silverman JB, Young BA, Nelson KM. National patterns in diabetes screening: data from the National Health and Nutrition Examination Survey (NHANES) 2005-2012. J Gen Intern Med. 2015;30(5):612-618. doi:10.1007/s11606-014-3147-8</w:t>
+        <w:t>12. Tan MY, Weng L, Yang ZH, Zhu SX, Wu S, Su JH. The association between non-high-density lipoprotein cholesterol to high-density lipoprotein cholesterol ratio with type 2 diabetes mellitus: recent findings from NHANES 2007-2018. Lipids Health Dis. 2024;23(1):151. doi:10.1186/s12944-024-02143-8</w:t>
       </w:r>
     </w:p>
     <w:p>
@@ -9166,7 +9166,7 @@
           <w:b w:val="0"/>
           <w:sz w:val="20"/>
         </w:rPr>
-        <w:t>13. Staimez LR, Kipling LM, Nina Ham J, Legvold BT, Jackson SL, Wilson PWF, Rhee MK, Phillips LS. Potential misclassification of diabetes and prediabetes in the U.S.: mismatched HbA1c and glucose in NHANES 2005-2016. Diabetes Res Clin Pract. 2022;189:109935. doi:10.1016/j.diabres.2022.109935</w:t>
+        <w:t>13. Seo IH, Son DH, Lee HS, Lee YJ. Non-HDL cholesterol as a predictor for incident type 2 diabetes in community-dwelling adults: longitudinal findings over 12 years. Transl Res. 2022;243:52-59. doi:10.1016/j.trsl.2021.12.008</w:t>
       </w:r>
     </w:p>
     <w:p>
@@ -9176,7 +9176,7 @@
           <w:b w:val="0"/>
           <w:sz w:val="20"/>
         </w:rPr>
-        <w:t>14. Firouzi SA, Tucker LA, LeCheminant JD, Bailey BW. Sagittal abdominal diameter, waist circumference, and BMI as predictors of multiple measures of glucose metabolism: an NHANES investigation of US adults. J Diabetes Res. 2018;2018:3604108. doi:10.1155/2018/3604108</w:t>
+        <w:t>14. Ley SH, Harris SB, Connelly PW, Mamakeesick M, Gittelsohn J, Wolever TM, Hegele RA, Zinman B, Hanley AJ. Utility of non-high-density lipoprotein cholesterol in assessing incident type 2 diabetes risk. Diabetes Obes Metab. 2012;14(9):821-825. doi:10.1111/j.1463-1326.2012.01607.x</w:t>
       </w:r>
     </w:p>
     <w:p>
@@ -9186,7 +9186,7 @@
           <w:b w:val="0"/>
           <w:sz w:val="20"/>
         </w:rPr>
-        <w:t>15. Tan MY, Weng L, Yang ZH, Zhu SX, Wu S, Su JH. The association between non-high-density lipoprotein cholesterol to high-density lipoprotein cholesterol ratio with type 2 diabetes mellitus: recent findings from NHANES 2007-2018. Lipids Health Dis. 2024;23(1):151. doi:10.1186/s12944-024-02143-8</w:t>
+        <w:t>15. Centers for Disease Control and Prevention, National Center for Health Statistics. Glycohemoglobin, GHB_J, NHANES 2017-2018 Data Documentation, Codebook, and Frequencies. Accessed June 10, 2026. https://wwwn.cdc.gov/Nchs/Data/Nhanes/Public/2017/DataFiles/GHB_J.htm</w:t>
       </w:r>
     </w:p>
     <w:p>
@@ -9196,7 +9196,7 @@
           <w:b w:val="0"/>
           <w:sz w:val="20"/>
         </w:rPr>
-        <w:t>16. Seo IH, Son DH, Lee HS, Lee YJ. Non-HDL cholesterol as a predictor for incident type 2 diabetes in community-dwelling adults: longitudinal findings over 12 years. Transl Res. 2022;243:52-59. doi:10.1016/j.trsl.2021.12.008</w:t>
+        <w:t>16. Centers for Disease Control and Prevention, National Center for Health Statistics. NHANES 2017-2018 Laboratory Data. Accessed June 10, 2026. https://wwwn.cdc.gov/nchs/nhanes/search/datapage.aspx?Component=Laboratory&amp;Cycle=2017-2018</w:t>
       </w:r>
     </w:p>
     <w:p>
@@ -9206,7 +9206,7 @@
           <w:b w:val="0"/>
           <w:sz w:val="20"/>
         </w:rPr>
-        <w:t>17. Ley SH, Harris SB, Connelly PW, Mamakeesick M, Gittelsohn J, Wolever TM, Hegele RA, Zinman B, Hanley AJ. Utility of non-high-density lipoprotein cholesterol in assessing incident type 2 diabetes risk. Diabetes Obes Metab. 2012;14(9):821-825. doi:10.1111/j.1463-1326.2012.01607.x</w:t>
+        <w:t>17. Healthy People 2030. Reduce the proportion of adults who do not know they have prediabetes: D-02. Accessed June 10, 2026. https://odphp.health.gov/healthypeople/objectives-and-data/browse-objectives/diabetes/reduce-proportion-adults-who-dont-know-they-have-prediabetes-d-02/data-methodology</w:t>
       </w:r>
     </w:p>
     <w:p>
@@ -9227,54 +9227,6 @@
           <w:sz w:val="20"/>
         </w:rPr>
         <w:t>19. Sheehy A, Pandhi N, Coursin DB, Flood GE, Kraft SA, Johnson HM, Smith MA. Minority status and diabetes screening in an ambulatory population. Diabetes Care. 2011;34(6):1289-1294. doi:10.2337/dc10-1785</w:t>
-      </w:r>
-    </w:p>
-    <w:p>
-      <w:pPr>
-        <w:jc w:val="center"/>
-      </w:pPr>
-      <w:r>
-        <w:rPr>
-          <w:rFonts w:ascii="Times New Roman" w:hAnsi="Times New Roman"/>
-          <w:b/>
-          <w:color w:val="1F4E79"/>
-          <w:sz w:val="36"/>
-        </w:rPr>
-        <w:t>Data Availability</w:t>
-      </w:r>
-    </w:p>
-    <w:p>
-      <w:r>
-        <w:rPr>
-          <w:rFonts w:ascii="Times New Roman" w:hAnsi="Times New Roman"/>
-          <w:b w:val="0"/>
-          <w:sz w:val="20"/>
-        </w:rPr>
-        <w:t>NHANES 2017-2018 public-use files are available from CDC/NCHS. Analysis scripts and derived non-identifiable outputs for this project are stored in the local workflow directory under artifacts/ and results/.</w:t>
-      </w:r>
-    </w:p>
-    <w:p>
-      <w:pPr>
-        <w:jc w:val="center"/>
-      </w:pPr>
-      <w:r>
-        <w:rPr>
-          <w:rFonts w:ascii="Times New Roman" w:hAnsi="Times New Roman"/>
-          <w:b/>
-          <w:color w:val="1F4E79"/>
-          <w:sz w:val="36"/>
-        </w:rPr>
-        <w:t>Ethics Statement</w:t>
-      </w:r>
-    </w:p>
-    <w:p>
-      <w:r>
-        <w:rPr>
-          <w:rFonts w:ascii="Times New Roman" w:hAnsi="Times New Roman"/>
-          <w:b w:val="0"/>
-          <w:sz w:val="20"/>
-        </w:rPr>
-        <w:t>This secondary analysis used publicly available, de-identified NHANES data. NHANES protocols are reviewed by the NCHS Research Ethics Review Board, and no additional participant contact occurred in this analysis.</w:t>
       </w:r>
     </w:p>
     <w:sectPr>

</xml_diff>

<commit_message>
Preserve trailing manuscript sections after references
</commit_message>
<xml_diff>
--- a/examples/nhanes-undiagnosed-diabetes/submission_package/manuscript_final_with_tables_figures.docx
+++ b/examples/nhanes-undiagnosed-diabetes/submission_package/manuscript_final_with_tables_figures.docx
@@ -9229,6 +9229,54 @@
         <w:t>19. Sheehy A, Pandhi N, Coursin DB, Flood GE, Kraft SA, Johnson HM, Smith MA. Minority status and diabetes screening in an ambulatory population. Diabetes Care. 2011;34(6):1289-1294. doi:10.2337/dc10-1785</w:t>
       </w:r>
     </w:p>
+    <w:p>
+      <w:pPr>
+        <w:jc w:val="center"/>
+      </w:pPr>
+      <w:r>
+        <w:rPr>
+          <w:rFonts w:ascii="Times New Roman" w:hAnsi="Times New Roman"/>
+          <w:b/>
+          <w:color w:val="1F4E79"/>
+          <w:sz w:val="36"/>
+        </w:rPr>
+        <w:t>Data Availability</w:t>
+      </w:r>
+    </w:p>
+    <w:p>
+      <w:r>
+        <w:rPr>
+          <w:rFonts w:ascii="Times New Roman" w:hAnsi="Times New Roman"/>
+          <w:b w:val="0"/>
+          <w:sz w:val="20"/>
+        </w:rPr>
+        <w:t>NHANES 2017-2018 public-use files are available from CDC/NCHS. Analysis scripts and derived non-identifiable outputs for this project are stored in the local workflow directory under artifacts/ and results/.</w:t>
+      </w:r>
+    </w:p>
+    <w:p>
+      <w:pPr>
+        <w:jc w:val="center"/>
+      </w:pPr>
+      <w:r>
+        <w:rPr>
+          <w:rFonts w:ascii="Times New Roman" w:hAnsi="Times New Roman"/>
+          <w:b/>
+          <w:color w:val="1F4E79"/>
+          <w:sz w:val="36"/>
+        </w:rPr>
+        <w:t>Ethics Statement</w:t>
+      </w:r>
+    </w:p>
+    <w:p>
+      <w:r>
+        <w:rPr>
+          <w:rFonts w:ascii="Times New Roman" w:hAnsi="Times New Roman"/>
+          <w:b w:val="0"/>
+          <w:sz w:val="20"/>
+        </w:rPr>
+        <w:t>This secondary analysis used publicly available, de-identified NHANES data. NHANES protocols are reviewed by the NCHS Research Ethics Review Board, and no additional participant contact occurred in this analysis.</w:t>
+      </w:r>
+    </w:p>
     <w:sectPr>
       <w:pgSz w:w="12240" w:h="15840"/>
       <w:pgMar w:top="1080" w:right="936" w:bottom="1080" w:left="936" w:header="720" w:footer="720" w:gutter="0"/>

</xml_diff>